<commit_message>
docs(estudio): v1.1 -- anade el fiduciario humano (Habivio) como segundo eje
Nueva seccion 2.b: Habivio (personal shopper, Alicante) = eje representacion/verdad,
complementa a Huispedia (eje precio). Tesis reescrita a dos ejes; +3 accionables
(checklist del foso = auditoria del comprador; personal shopper como handoff humano
ideal; mensaje "coste = libertad"); Habivio en fuentes con asterisco.

Co-Authored-By: Claude Opus 4.8 <noreply@anthropic.com>
</commit_message>
<xml_diff>
--- a/docs/ESTUDIO_Portales_Giro_ProComprador_2026-07.docx
+++ b/docs/ESTUDIO_Portales_Giro_ProComprador_2026-07.docx
@@ -15,7 +15,7 @@
         <w:pStyle w:val="Heading2"/>
       </w:pPr>
       <w:r>
-        <w:t>De la señal de Edmund Keith al caso Huispedia · investigación + accionables</w:t>
+        <w:t>De la señal de Edmund Keith a los casos vivos (Huispedia + Habivio) · investigación + accionables</w:t>
       </w:r>
     </w:p>
     <w:p>
@@ -44,7 +44,7 @@
         <w:t>Estado:</w:t>
       </w:r>
       <w:r>
-        <w:t xml:space="preserve"> v1.0, borrador para red-team del fundador</w:t>
+        <w:t xml:space="preserve"> v1.1, borrador para red-team del fundador</w:t>
       </w:r>
     </w:p>
     <w:p>
@@ -58,7 +58,7 @@
         <w:t>Tesis en una línea.</w:t>
       </w:r>
       <w:r>
-        <w:t xml:space="preserve"> Un analista de la propia industria de portales declara en público lo que Contexto viene sosteniendo: el lado del comprador es la frontera. Un retador real (Huispedia, NL) ya lo opera. Pero ambos anclan su "verdad" en el </w:t>
+        <w:t xml:space="preserve"> El giro pro-comprador dejó de ser teoría: un analista de portales lo predica (Keith), un retador digital lo opera sobre el eje </w:t>
       </w:r>
       <w:r>
         <w:rPr>
@@ -67,16 +67,16 @@
         <w:t>precio</w:t>
       </w:r>
       <w:r>
-        <w:t xml:space="preserve"> —sobre dato público que en LATAM no existe—, no en la </w:t>
+        <w:t xml:space="preserve"> (Huispedia, NL) y un fiduciario humano sobre el eje </w:t>
       </w:r>
       <w:r>
         <w:rPr>
           <w:b/>
         </w:rPr>
-        <w:t>verdad del terreno</w:t>
-      </w:r>
-      <w:r>
-        <w:t>. Eso confirma la categoría y, por contraste, afila el foso de Contexto.</w:t>
+        <w:t>representación + verdad del inmueble</w:t>
+      </w:r>
+      <w:r>
+        <w:t xml:space="preserve"> (Habivio, ES). Contexto vive en el segundo eje —la verdad del lugar— y sobre el sustrato que ninguno tiene: dato verificado donde el público no existe (LATAM).</w:t>
       </w:r>
     </w:p>
     <w:p>
@@ -137,7 +137,7 @@
         <w:rPr>
           <w:b/>
         </w:rPr>
-        <w:t>El caso vivo:</w:t>
+        <w:t>El caso vivo (digital):</w:t>
       </w:r>
       <w:r>
         <w:t xml:space="preserve"> investigación web de </w:t>
@@ -159,6 +159,29 @@
       </w:r>
       <w:r>
         <w:t xml:space="preserve"> de su producto (Claude-in-Chrome, 2026-07-23) sobre una vivienda real.</w:t>
+      </w:r>
+    </w:p>
+    <w:p>
+      <w:pPr>
+        <w:pStyle w:val="ListNumber"/>
+      </w:pPr>
+      <w:r>
+        <w:rPr>
+          <w:b/>
+        </w:rPr>
+        <w:t>El caso vivo (humano):</w:t>
+      </w:r>
+      <w:r>
+        <w:t xml:space="preserve"> investigación web de </w:t>
+      </w:r>
+      <w:r>
+        <w:rPr>
+          <w:b/>
+        </w:rPr>
+        <w:t>Habivio</w:t>
+      </w:r>
+      <w:r>
+        <w:t xml:space="preserve"> (personal shopper inmobiliario, Alicante) — el eje representación/verdad.</w:t>
       </w:r>
     </w:p>
     <w:p>
@@ -735,6 +758,276 @@
       </w:r>
       <w:r>
         <w:t>, no Google.</w:t>
+      </w:r>
+    </w:p>
+    <w:p>
+      <w:pPr>
+        <w:pStyle w:val="Heading1"/>
+      </w:pPr>
+      <w:r>
+        <w:t>2.b El fiduciario humano — Habivio (personal shopper, España): el eje representación/verdad</w:t>
+      </w:r>
+    </w:p>
+    <w:p>
+      <w:r>
+        <w:t xml:space="preserve">Si Huispedia ocupa el eje </w:t>
+      </w:r>
+      <w:r>
+        <w:rPr>
+          <w:b/>
+        </w:rPr>
+        <w:t>precio</w:t>
+      </w:r>
+      <w:r>
+        <w:t xml:space="preserve">, Habivio ocupa el otro eje del giro pro-comprador: </w:t>
+      </w:r>
+      <w:r>
+        <w:rPr>
+          <w:b/>
+        </w:rPr>
+        <w:t>representación + verdad del inmueble</w:t>
+      </w:r>
+      <w:r>
+        <w:t xml:space="preserve"> — el más cercano a Contexto.</w:t>
+      </w:r>
+    </w:p>
+    <w:p>
+      <w:r>
+        <w:rPr>
+          <w:b/>
+        </w:rPr>
+        <w:t>Ficha:</w:t>
+      </w:r>
+      <w:r>
+        <w:t xml:space="preserve"> Juan Castillo (Alicante). Representa </w:t>
+      </w:r>
+      <w:r>
+        <w:rPr>
+          <w:b/>
+        </w:rPr>
+        <w:t>exclusivamente al comprador</w:t>
+      </w:r>
+      <w:r>
+        <w:t xml:space="preserve"> — *"No vendemos viviendas. Solo representamos a quien compra."* </w:t>
+      </w:r>
+      <w:r>
+        <w:rPr>
+          <w:b/>
+        </w:rPr>
+        <w:t>Cero tecnología/IA</w:t>
+      </w:r>
+      <w:r>
+        <w:t xml:space="preserve"> (solo una calculadora de gastos). 5 años con inversores, 1,5 con particulares.</w:t>
+      </w:r>
+    </w:p>
+    <w:p>
+      <w:r>
+        <w:rPr>
+          <w:b/>
+        </w:rPr>
+        <w:t>El modelo:</w:t>
+      </w:r>
+    </w:p>
+    <w:p>
+      <w:pPr>
+        <w:pStyle w:val="ListBullet"/>
+      </w:pPr>
+      <w:r>
+        <w:rPr>
+          <w:b/>
+        </w:rPr>
+        <w:t>5 fases:</w:t>
+      </w:r>
+      <w:r>
+        <w:t xml:space="preserve"> Diagnóstico (perfil/presupuesto) → Búsqueda (filtra el mercado completo) → Visitas solo a lo que encaja → </w:t>
+      </w:r>
+      <w:r>
+        <w:rPr>
+          <w:b/>
+        </w:rPr>
+        <w:t>Auditoría integral + negociación</w:t>
+      </w:r>
+      <w:r>
+        <w:t xml:space="preserve"> → Cierre y post-compra.</w:t>
+      </w:r>
+    </w:p>
+    <w:p>
+      <w:pPr>
+        <w:pStyle w:val="ListBullet"/>
+      </w:pPr>
+      <w:r>
+        <w:rPr>
+          <w:b/>
+        </w:rPr>
+        <w:t>Auditoría integral:</w:t>
+      </w:r>
+      <w:r>
+        <w:t xml:space="preserve"> legal · técnico · urbanístico · </w:t>
+      </w:r>
+      <w:r>
+        <w:rPr>
+          <w:b/>
+        </w:rPr>
+        <w:t>vecinal</w:t>
+      </w:r>
+      <w:r>
+        <w:t xml:space="preserve"> — *"la tranquilidad de saber qué estás comprando, sin sorpresas, sin imprevistos."*</w:t>
+      </w:r>
+    </w:p>
+    <w:p>
+      <w:pPr>
+        <w:pStyle w:val="ListBullet"/>
+      </w:pPr>
+      <w:r>
+        <w:rPr>
+          <w:b/>
+        </w:rPr>
+        <w:t>Honorarios:</w:t>
+      </w:r>
+      <w:r>
+        <w:t xml:space="preserve"> success-fee híbrido — honorarios cerrados pactados (NO % de comisión) + provisión inicial + </w:t>
+      </w:r>
+      <w:r>
+        <w:rPr>
+          <w:b/>
+        </w:rPr>
+        <w:t>pago principal solo tras firma en notaría</w:t>
+      </w:r>
+      <w:r>
+        <w:t xml:space="preserve">. Lo paga </w:t>
+      </w:r>
+      <w:r>
+        <w:rPr>
+          <w:b/>
+        </w:rPr>
+        <w:t>el comprador, contingente al cierre.</w:t>
+      </w:r>
+      <w:r>
+        <w:t xml:space="preserve"> Atiende </w:t>
+      </w:r>
+      <w:r>
+        <w:rPr>
+          <w:b/>
+        </w:rPr>
+        <w:t>compradores a distancia</w:t>
+      </w:r>
+      <w:r>
+        <w:t>.</w:t>
+      </w:r>
+    </w:p>
+    <w:p>
+      <w:r>
+        <w:rPr>
+          <w:b/>
+        </w:rPr>
+        <w:t>Qué añade al estudio:</w:t>
+      </w:r>
+    </w:p>
+    <w:p>
+      <w:pPr>
+        <w:pStyle w:val="ListBullet"/>
+      </w:pPr>
+      <w:r>
+        <w:rPr>
+          <w:b/>
+        </w:rPr>
+        <w:t>Es el modelo-superviviente de la tesis, en humano.</w:t>
+      </w:r>
+      <w:r>
+        <w:t xml:space="preserve"> Fiduciario del comprador + success-fee contingente al cierre = el único patrón que sobrevive (tesis Senales-Brain). Confirma que </w:t>
+      </w:r>
+      <w:r>
+        <w:rPr>
+          <w:b/>
+        </w:rPr>
+        <w:t>el comprador sí paga</w:t>
+      </w:r>
+      <w:r>
+        <w:t xml:space="preserve"> por representación de alto valor (como Roam).</w:t>
+      </w:r>
+    </w:p>
+    <w:p>
+      <w:pPr>
+        <w:pStyle w:val="ListBullet"/>
+      </w:pPr>
+      <w:r>
+        <w:rPr>
+          <w:b/>
+        </w:rPr>
+        <w:t>Su "auditoría integral" ES la verdad verificada de Contexto — pero manual e inescalable</w:t>
+      </w:r>
+      <w:r>
+        <w:t xml:space="preserve"> (1 cliente, 1 ciudad, sin dato que se acumule). Contexto la vuelve </w:t>
+      </w:r>
+      <w:r>
+        <w:rPr>
+          <w:b/>
+        </w:rPr>
+        <w:t>activo de dato que compone</w:t>
+      </w:r>
+      <w:r>
+        <w:t xml:space="preserve"> (Catastro Vivo). Es la validación </w:t>
+      </w:r>
+      <w:r>
+        <w:rPr>
+          <w:b/>
+        </w:rPr>
+        <w:t>y</w:t>
+      </w:r>
+      <w:r>
+        <w:t xml:space="preserve"> el techo del modelo humano-puro.</w:t>
+      </w:r>
+    </w:p>
+    <w:p>
+      <w:pPr>
+        <w:pStyle w:val="ListBullet"/>
+      </w:pPr>
+      <w:r>
+        <w:rPr>
+          <w:b/>
+        </w:rPr>
+        <w:t>Ancla en la verdad, no en el precio</w:t>
+      </w:r>
+      <w:r>
+        <w:t xml:space="preserve"> — filosóficamente más cerca de Contexto que los portales. Tercera confirmación de la semana: el whitespace es la verdad y la representación, no el precio.</w:t>
+      </w:r>
+    </w:p>
+    <w:p>
+      <w:r>
+        <w:rPr>
+          <w:b/>
+        </w:rPr>
+        <w:t>Asterisco:</w:t>
+      </w:r>
+      <w:r>
+        <w:t xml:space="preserve"> sitio </w:t>
+      </w:r>
+      <w:r>
+        <w:rPr>
+          <w:b/>
+        </w:rPr>
+        <w:t>promocional</w:t>
+      </w:r>
+      <w:r>
+        <w:t xml:space="preserve">, </w:t>
+      </w:r>
+      <w:r>
+        <w:rPr>
+          <w:b/>
+        </w:rPr>
+        <w:t>n=1</w:t>
+      </w:r>
+      <w:r>
+        <w:t xml:space="preserve">, </w:t>
+      </w:r>
+      <w:r>
+        <w:rPr>
+          <w:b/>
+        </w:rPr>
+        <w:t>mercado maduro</w:t>
+      </w:r>
+      <w:r>
+        <w:t xml:space="preserve"> (España, con Idealista/catastro), sin cifras de honorarios publicadas. *Per Habivio / Juan Castillo (LinkedIn + habivio.es, 2026).*</w:t>
       </w:r>
     </w:p>
     <w:p>
@@ -1253,6 +1546,110 @@
         <w:pStyle w:val="Heading2"/>
       </w:pPr>
       <w:r>
+        <w:t>Del fiduciario humano (Habivio)</w:t>
+      </w:r>
+    </w:p>
+    <w:p>
+      <w:pPr>
+        <w:pStyle w:val="ListNumber"/>
+      </w:pPr>
+      <w:r>
+        <w:rPr>
+          <w:b/>
+        </w:rPr>
+        <w:t>Checklist del foso = la auditoría del comprador.</w:t>
+      </w:r>
+      <w:r>
+        <w:t xml:space="preserve"> (Observado→adoptar) Mapea las capas de verdad de Contexto al miedo real: </w:t>
+      </w:r>
+      <w:r>
+        <w:rPr>
+          <w:b/>
+        </w:rPr>
+        <w:t>legal</w:t>
+      </w:r>
+      <w:r>
+        <w:t xml:space="preserve"> (cédula/escrituras → Legal Parser) · </w:t>
+      </w:r>
+      <w:r>
+        <w:rPr>
+          <w:b/>
+        </w:rPr>
+        <w:t>técnico</w:t>
+      </w:r>
+      <w:r>
+        <w:t xml:space="preserve"> (estado → visión) · </w:t>
+      </w:r>
+      <w:r>
+        <w:rPr>
+          <w:b/>
+        </w:rPr>
+        <w:t>urbanístico</w:t>
+      </w:r>
+      <w:r>
+        <w:t xml:space="preserve"> (riesgo físico/uso de suelo) · </w:t>
+      </w:r>
+      <w:r>
+        <w:rPr>
+          <w:b/>
+        </w:rPr>
+        <w:t>vecinal</w:t>
+      </w:r>
+      <w:r>
+        <w:t xml:space="preserve"> (carácter de zona, con candado Fair Housing).</w:t>
+      </w:r>
+    </w:p>
+    <w:p>
+      <w:pPr>
+        <w:pStyle w:val="ListNumber"/>
+      </w:pPr>
+      <w:r>
+        <w:rPr>
+          <w:b/>
+        </w:rPr>
+        <w:t>El personal shopper es el handoff humano ideal</w:t>
+      </w:r>
+      <w:r>
+        <w:t xml:space="preserve"> (del lado del comprador). En LATAM casi no existe → Contexto lo </w:t>
+      </w:r>
+      <w:r>
+        <w:rPr>
+          <w:b/>
+        </w:rPr>
+        <w:t>arma con verdad verificada</w:t>
+      </w:r>
+      <w:r>
+        <w:t xml:space="preserve"> donde emerja, o </w:t>
+      </w:r>
+      <w:r>
+        <w:rPr>
+          <w:b/>
+        </w:rPr>
+        <w:t>es la capa escalable</w:t>
+      </w:r>
+      <w:r>
+        <w:t xml:space="preserve"> donde no. (Hipótesis GTM.)</w:t>
+      </w:r>
+    </w:p>
+    <w:p>
+      <w:pPr>
+        <w:pStyle w:val="ListNumber"/>
+      </w:pPr>
+      <w:r>
+        <w:rPr>
+          <w:b/>
+        </w:rPr>
+        <w:t>Mensaje:</w:t>
+      </w:r>
+      <w:r>
+        <w:t xml:space="preserve"> el marco *"saber qué estás comprando, sin sorpresas"* + el *"coste = libertad"* de Juan Castillo — anclas emocionales para el manifiesto y el deck.</w:t>
+      </w:r>
+    </w:p>
+    <w:p>
+      <w:pPr>
+        <w:pStyle w:val="Heading2"/>
+      </w:pPr>
+      <w:r>
         <w:t>Compliance (estructural, no negociable)</w:t>
       </w:r>
     </w:p>
@@ -1370,6 +1767,14 @@
       </w:pPr>
       <w:r>
         <w:t>Huispedia — huispedia.nl (captura en vivo 2026-07-23) · perfiles de terceros: Tracxn, Crunchbase, Dealroom · Luntero (Huispedia vs Funda) · nota de prensa Huispedia ("data-organización del año 2026").</w:t>
+      </w:r>
+    </w:p>
+    <w:p>
+      <w:pPr>
+        <w:pStyle w:val="ListBullet"/>
+      </w:pPr>
+      <w:r>
+        <w:t>Habivio (personal shopper, Alicante) — habivio.es + habivio.es/particulares-2 · entrevista Alicante Plaza · LinkedIn Juan Castillo (2026). Sitio promocional, n=1, sin honorarios publicados.</w:t>
       </w:r>
     </w:p>
     <w:p>

</xml_diff>